<commit_message>
Verify 2022 Tianjin physics sources and correct topic records
</commit_message>
<xml_diff>
--- a/真题考点/天津/家长版/天津中考物理_给家长的备考说明_2022-2026.docx
+++ b/真题考点/天津/家长版/天津中考物理_给家长的备考说明_2022-2026.docx
@@ -12,7 +12,7 @@
     </w:p>
     <w:p>
       <w:r>
-        <w:t>2022至2026年资料核验修订  2026年10月21日</w:t>
+        <w:t>2022至2026年资料核验修订  2026年10月22日</w:t>
       </w:r>
     </w:p>
     <w:p>
@@ -496,7 +496,7 @@
     </w:p>
     <w:p>
       <w:r>
-        <w:t>旧资料未保存足以复查的逐题题面与答案定位，2026年部分综合题表达式也留有疑问。旧“基础盘约60分”列项合计54分，且可能重复计入小问，因此撤销这个目标。</w:t>
+        <w:t>2022年25题已逐题核对第三方转载的扫描卷和答案。第7题的大气压应用是用吸管喝饮料；第23题还考查重力势能与质量的关系，已修正。其余四年100条仍待核实，不能恢复五年频次。旧“基础盘约60分”列项合计54分且可能重复计入小问，不能作为得分保证。</w:t>
       </w:r>
     </w:p>
     <w:p>

</xml_diff>